<commit_message>
Audit portfolio research and clarify article evidence
</commit_message>
<xml_diff>
--- a/Portfolio optimization.docx
+++ b/Portfolio optimization.docx
@@ -7912,7 +7912,7 @@
                 <w:b w:val="0"/>
                 <w:sz w:val="18"/>
               </w:rPr>
-              <w:t>0.507</w:t>
+              <w:t>N/V</w:t>
             </w:r>
           </w:p>
         </w:tc>
@@ -8566,6 +8566,17 @@
       <w:pPr>
         <w:spacing w:after="0"/>
       </w:pPr>
+    </w:p>
+    <w:p>
+      <w:pPr>
+        <w:jc w:val="both"/>
+      </w:pPr>
+      <w:r>
+        <w:rPr>
+          <w:b w:val="0"/>
+        </w:rPr>
+        <w:t>N/V denotes an exposure not verified against the retained rebalance diagnostics. The equal-weight summary reports 0.507, but its detailed export contains a neutral 0.500 placeholder; the disputed value is withheld here. The other test quality exposures reconcile with their detailed exports. This reporting discrepancy does not change portfolio weights, returns or risk metrics.</w:t>
+      </w:r>
     </w:p>
     <w:p>
       <w:pPr>
@@ -13315,7 +13326,57 @@
         <w:rPr>
           <w:b w:val="0"/>
         </w:rPr>
-        <w:t>The five primary research notebooks have been executed with preserved rich outputs: 52 code cells, 21 embedded figures and 60 HTML table outputs, with no execution errors. Eight unit and temporal tests passed. Checks cover daily holding drift and costs, initial-wealth drawdown, empirical tail calculations, neutral missing scores, filing embargoes including exchange holidays, admissible real-data snapshots, and invariance of earlier forecasts to future or unmatured-label perturbations. Zero-strength controls recover the preceding pipeline, and mathematical source hashes match the frozen specification. These checks verify the implemented calculations and selected information boundaries; they do not remove the economic and data limitations discussed above.</w:t>
+        <w:t>The original experiment at repository commit 93676de retained five executed notebooks: 52 code cells, 21 embedded figures and 60 HTML table outputs, with no execution errors. Its recorded eight unit and temporal tests passed, zero-strength controls recovered the preceding pipeline, and that commit's mathematical source hashes match the frozen specification. These are records of the original run, not a claim that subsequently edited code has been re-executed.</w:t>
+      </w:r>
+    </w:p>
+    <w:p>
+      <w:pPr>
+        <w:jc w:val="both"/>
+      </w:pPr>
+      <w:r>
+        <w:rPr>
+          <w:b w:val="0"/>
+        </w:rPr>
+        <w:t xml:space="preserve">A subsequent repository review reconciled all 16 retained strategy–split result folders, including accounting, weight constraints and metric calculations; maximum metric discrepancy was below 5 × </w:t>
+      </w:r>
+      <m:oMath>
+        <m:sSup>
+          <m:e>
+            <m:r>
+              <w:rPr>
+                <w:rFonts w:ascii="Cambria Math" w:hAnsi="Cambria Math"/>
+                <w:sz w:val="22"/>
+              </w:rPr>
+              <m:t xml:space="preserve">10</m:t>
+            </m:r>
+          </m:e>
+          <m:sup>
+            <m:r>
+              <w:rPr>
+                <w:rFonts w:ascii="Cambria Math" w:hAnsi="Cambria Math"/>
+                <w:sz w:val="22"/>
+              </w:rPr>
+              <m:t xml:space="preserve">−14</m:t>
+            </m:r>
+          </m:sup>
+        </m:sSup>
+      </m:oMath>
+      <w:r>
+        <w:rPr>
+          <w:b w:val="0"/>
+        </w:rPr>
+        <w:t>. Validation selection, forecast summaries, cost and annual summaries, and all 15 paired-bootstrap comparison–block combinations were also recomputed from saved evidence. Four benchmark quality-exposure summaries disagree with neutral placeholders in detailed exports: three validation controls and test equal weighting. Those original files are retained for provenance, and the disputed article entry is withheld in Table 6. Reconstructing measured monthly exposure requires the original SEC snapshots.</w:t>
+      </w:r>
+    </w:p>
+    <w:p>
+      <w:pPr>
+        <w:jc w:val="both"/>
+      </w:pPr>
+      <w:r>
+        <w:rPr>
+          <w:b w:val="0"/>
+        </w:rPr>
+        <w:t>The reviewed implementation adds calendar-alignment checks, missing-issuer handling, asset-aware cache fingerprints, protected benchmark exports and explicit failure status. Offline tests include synthetic HMM and CatBoost future-information perturbations. The original raw inputs were unavailable in the review checkout, so the two real-data integration checks and a full economic rerun could not be repeated. Current source hashes intentionally differ from the historical freeze; no new test performance is claimed. The review supplements, rather than replaces, the original experiment and does not remove its economic or data limitations.</w:t>
       </w:r>
     </w:p>
     <w:p>

</xml_diff>